<commit_message>
Move relevant files to wsn management algorithms folder
</commit_message>
<xml_diff>
--- a/docs/Papers/paper_summaries.docx
+++ b/docs/Papers/paper_summaries.docx
@@ -79,19 +79,9 @@
           <w:lang w:val="en-US"/>
         </w:rPr>
       </w:pPr>
-      <w:proofErr w:type="spellStart"/>
-      <w:r>
-        <w:t>Centralized</w:t>
-      </w:r>
-      <w:proofErr w:type="spellEnd"/>
-      <w:r>
-        <w:t xml:space="preserve"> </w:t>
-      </w:r>
-      <w:proofErr w:type="spellStart"/>
-      <w:r>
-        <w:t>nodes</w:t>
-      </w:r>
-      <w:proofErr w:type="spellEnd"/>
+      <w:r>
+        <w:t>Centralized nodes</w:t>
+      </w:r>
     </w:p>
     <w:p>
       <w:pPr>
@@ -157,21 +147,7 @@
         <w:rPr>
           <w:lang w:val="en-US"/>
         </w:rPr>
-        <w:t xml:space="preserve">Energy management in solar cells powered wireless sensor networks for </w:t>
-      </w:r>
-      <w:proofErr w:type="gramStart"/>
-      <w:r>
-        <w:rPr>
-          <w:lang w:val="en-US"/>
-        </w:rPr>
-        <w:t>quality of service</w:t>
-      </w:r>
-      <w:proofErr w:type="gramEnd"/>
-      <w:r>
-        <w:rPr>
-          <w:lang w:val="en-US"/>
-        </w:rPr>
-        <w:t xml:space="preserve"> optimization</w:t>
+        <w:t>Energy management in solar cells powered wireless sensor networks for quality of service optimization</w:t>
       </w:r>
     </w:p>
     <w:p>
@@ -192,21 +168,8 @@
         <w:t xml:space="preserve">Explain </w:t>
       </w:r>
       <w:r>
-        <w:t>Energy-</w:t>
-      </w:r>
-      <w:proofErr w:type="spellStart"/>
-      <w:r>
-        <w:t>harvesting</w:t>
-      </w:r>
-      <w:proofErr w:type="spellEnd"/>
-      <w:r>
-        <w:t xml:space="preserve"> </w:t>
-      </w:r>
-      <w:proofErr w:type="spellStart"/>
-      <w:r>
-        <w:t>system</w:t>
-      </w:r>
-      <w:proofErr w:type="spellEnd"/>
+        <w:t>Energy-harvesting system</w:t>
+      </w:r>
     </w:p>
     <w:p>
       <w:pPr>
@@ -265,21 +228,7 @@
         <w:rPr>
           <w:lang w:val="en-US"/>
         </w:rPr>
-        <w:t xml:space="preserve">Another </w:t>
-      </w:r>
-      <w:proofErr w:type="gramStart"/>
-      <w:r>
-        <w:rPr>
-          <w:lang w:val="en-US"/>
-        </w:rPr>
-        <w:t>algorithm,</w:t>
-      </w:r>
-      <w:proofErr w:type="gramEnd"/>
-      <w:r>
-        <w:rPr>
-          <w:lang w:val="en-US"/>
-        </w:rPr>
-        <w:t xml:space="preserve"> gets (sub-) optimal solution</w:t>
+        <w:t>Another algorithm, gets (sub-) optimal solution</w:t>
       </w:r>
     </w:p>
     <w:p>
@@ -315,21 +264,7 @@
         <w:rPr>
           <w:lang w:val="en-US"/>
         </w:rPr>
-        <w:t>O(n*(</w:t>
-      </w:r>
-      <w:proofErr w:type="spellStart"/>
-      <w:r>
-        <w:rPr>
-          <w:lang w:val="en-US"/>
-        </w:rPr>
-        <w:t>k+n</w:t>
-      </w:r>
-      <w:proofErr w:type="spellEnd"/>
-      <w:r>
-        <w:rPr>
-          <w:lang w:val="en-US"/>
-        </w:rPr>
-        <w:t>))</w:t>
+        <w:t>O(n*(k+n))</w:t>
       </w:r>
     </w:p>
     <w:p>
@@ -426,21 +361,7 @@
         <w:rPr>
           <w:lang w:val="en-US"/>
         </w:rPr>
-        <w:t xml:space="preserve">Also </w:t>
-      </w:r>
-      <w:proofErr w:type="gramStart"/>
-      <w:r>
-        <w:rPr>
-          <w:lang w:val="en-US"/>
-        </w:rPr>
-        <w:t>takes into account</w:t>
-      </w:r>
-      <w:proofErr w:type="gramEnd"/>
-      <w:r>
-        <w:rPr>
-          <w:lang w:val="en-US"/>
-        </w:rPr>
-        <w:t xml:space="preserve"> using produced energ</w:t>
+        <w:t>Also takes into account using produced energ</w:t>
       </w:r>
       <w:r>
         <w:rPr>
@@ -607,29 +528,8 @@
         </w:rPr>
       </w:pPr>
       <w:r>
-        <w:t xml:space="preserve">Energy-neutral </w:t>
-      </w:r>
-      <w:proofErr w:type="spellStart"/>
-      <w:r>
-        <w:t>networked</w:t>
-      </w:r>
-      <w:proofErr w:type="spellEnd"/>
-      <w:r>
-        <w:t xml:space="preserve"> </w:t>
-      </w:r>
-      <w:proofErr w:type="spellStart"/>
-      <w:r>
-        <w:t>wireless</w:t>
-      </w:r>
-      <w:proofErr w:type="spellEnd"/>
-      <w:r>
-        <w:t xml:space="preserve"> </w:t>
-      </w:r>
-      <w:proofErr w:type="spellStart"/>
-      <w:r>
-        <w:t>sensors</w:t>
-      </w:r>
-      <w:proofErr w:type="spellEnd"/>
+        <w:t>Energy-neutral networked wireless sensors</w:t>
+      </w:r>
     </w:p>
     <w:p>
       <w:pPr>
@@ -664,21 +564,7 @@
         <w:rPr>
           <w:lang w:val="en-US"/>
         </w:rPr>
-        <w:t xml:space="preserve">Algorithm also </w:t>
-      </w:r>
-      <w:proofErr w:type="gramStart"/>
-      <w:r>
-        <w:rPr>
-          <w:lang w:val="en-US"/>
-        </w:rPr>
-        <w:t>similar to</w:t>
-      </w:r>
-      <w:proofErr w:type="gramEnd"/>
-      <w:r>
-        <w:rPr>
-          <w:lang w:val="en-US"/>
-        </w:rPr>
-        <w:t xml:space="preserve"> 2</w:t>
+        <w:t>Algorithm also similar to 2</w:t>
       </w:r>
     </w:p>
     <w:p>
@@ -1193,32 +1079,11 @@
         <w:rPr>
           <w:lang w:val="en-US"/>
         </w:rPr>
-        <w:t xml:space="preserve">Harvesting </w:t>
-      </w:r>
-      <w:proofErr w:type="spellStart"/>
-      <w:r>
-        <w:rPr>
-          <w:lang w:val="en-US"/>
-        </w:rPr>
-        <w:t>theor</w:t>
-      </w:r>
-      <w:proofErr w:type="spellEnd"/>
-      <w:r>
-        <w:t>y/</w:t>
-      </w:r>
-      <w:proofErr w:type="spellStart"/>
-      <w:r>
-        <w:t>energy</w:t>
-      </w:r>
-      <w:proofErr w:type="spellEnd"/>
-      <w:r>
-        <w:t xml:space="preserve"> </w:t>
-      </w:r>
-      <w:proofErr w:type="spellStart"/>
-      <w:r>
-        <w:t>neutrality</w:t>
-      </w:r>
-      <w:proofErr w:type="spellEnd"/>
+        <w:t>Harvesting theor</w:t>
+      </w:r>
+      <w:r>
+        <w:t>y/energy neutrality</w:t>
+      </w:r>
     </w:p>
     <w:p>
       <w:pPr>
@@ -1233,29 +1098,8 @@
         </w:rPr>
       </w:pPr>
       <w:r>
-        <w:t xml:space="preserve">Also </w:t>
-      </w:r>
-      <w:proofErr w:type="spellStart"/>
-      <w:r>
-        <w:t>duty</w:t>
-      </w:r>
-      <w:proofErr w:type="spellEnd"/>
-      <w:r>
-        <w:t xml:space="preserve"> </w:t>
-      </w:r>
-      <w:proofErr w:type="spellStart"/>
-      <w:r>
-        <w:t>cycling</w:t>
-      </w:r>
-      <w:proofErr w:type="spellEnd"/>
-      <w:r>
-        <w:t xml:space="preserve"> </w:t>
-      </w:r>
-      <w:proofErr w:type="spellStart"/>
-      <w:r>
-        <w:t>model</w:t>
-      </w:r>
-      <w:proofErr w:type="spellEnd"/>
+        <w:t>Also duty cycling model</w:t>
+      </w:r>
     </w:p>
     <w:p>
       <w:pPr>
@@ -1270,15 +1114,7 @@
         </w:rPr>
       </w:pPr>
       <w:r>
-        <w:t xml:space="preserve">Quality: </w:t>
-      </w:r>
-      <w:proofErr w:type="spellStart"/>
-      <w:r>
-        <w:t>utility</w:t>
-      </w:r>
-      <w:proofErr w:type="spellEnd"/>
-      <w:r>
-        <w:t xml:space="preserve"> U</w:t>
+        <w:t>Quality: utility U</w:t>
       </w:r>
     </w:p>
     <w:p>
@@ -1293,19 +1129,9 @@
           <w:lang w:val="en-US"/>
         </w:rPr>
       </w:pPr>
-      <w:proofErr w:type="spellStart"/>
-      <w:r>
-        <w:t>Solve</w:t>
-      </w:r>
-      <w:proofErr w:type="spellEnd"/>
-      <w:r>
-        <w:t xml:space="preserve"> linear </w:t>
-      </w:r>
-      <w:proofErr w:type="spellStart"/>
-      <w:r>
-        <w:t>program</w:t>
-      </w:r>
-      <w:proofErr w:type="spellEnd"/>
+      <w:r>
+        <w:t>Solve linear program</w:t>
+      </w:r>
     </w:p>
     <w:p>
       <w:pPr>
@@ -1323,21 +1149,7 @@
         <w:rPr>
           <w:lang w:val="en-US"/>
         </w:rPr>
-        <w:t>Power input prediction (</w:t>
-      </w:r>
-      <w:proofErr w:type="spellStart"/>
-      <w:r>
-        <w:rPr>
-          <w:lang w:val="en-US"/>
-        </w:rPr>
-        <w:t>ewma</w:t>
-      </w:r>
-      <w:proofErr w:type="spellEnd"/>
-      <w:r>
-        <w:rPr>
-          <w:lang w:val="en-US"/>
-        </w:rPr>
-        <w:t xml:space="preserve"> f</w:t>
+        <w:t>Power input prediction (ewma f</w:t>
       </w:r>
       <w:r>
         <w:rPr>
@@ -1404,33 +1216,11 @@
           <w:lang w:val="en-US"/>
         </w:rPr>
       </w:pPr>
-      <w:proofErr w:type="gramStart"/>
-      <w:r>
-        <w:rPr>
-          <w:lang w:val="en-US"/>
-        </w:rPr>
-        <w:t>Also</w:t>
-      </w:r>
-      <w:proofErr w:type="gramEnd"/>
-      <w:r>
-        <w:rPr>
-          <w:lang w:val="en-US"/>
-        </w:rPr>
-        <w:t xml:space="preserve"> </w:t>
-      </w:r>
-      <w:proofErr w:type="spellStart"/>
-      <w:r>
-        <w:rPr>
-          <w:lang w:val="en-US"/>
-        </w:rPr>
-        <w:t>ewma</w:t>
-      </w:r>
-      <w:proofErr w:type="spellEnd"/>
-      <w:r>
-        <w:rPr>
-          <w:lang w:val="en-US"/>
-        </w:rPr>
-        <w:t xml:space="preserve"> filter for energy i</w:t>
+      <w:r>
+        <w:rPr>
+          <w:lang w:val="en-US"/>
+        </w:rPr>
+        <w:t>Also ewma filter for energy i</w:t>
       </w:r>
       <w:r>
         <w:rPr>
@@ -1577,13 +1367,8 @@
         </w:rPr>
       </w:pPr>
       <w:r>
-        <w:t xml:space="preserve">Energy </w:t>
-      </w:r>
-      <w:proofErr w:type="spellStart"/>
-      <w:r>
-        <w:t>usage</w:t>
-      </w:r>
-      <w:proofErr w:type="spellEnd"/>
+        <w:t>Energy usage</w:t>
+      </w:r>
     </w:p>
     <w:p>
       <w:pPr>
@@ -1598,21 +1383,8 @@
         </w:rPr>
       </w:pPr>
       <w:r>
-        <w:t xml:space="preserve">Data </w:t>
-      </w:r>
-      <w:proofErr w:type="spellStart"/>
-      <w:r>
-        <w:t>availability</w:t>
-      </w:r>
-      <w:proofErr w:type="spellEnd"/>
-      <w:r>
-        <w:t>/</w:t>
-      </w:r>
-      <w:proofErr w:type="spellStart"/>
-      <w:r>
-        <w:t>accuracy</w:t>
-      </w:r>
-      <w:proofErr w:type="spellEnd"/>
+        <w:t>Data availability/accuracy</w:t>
+      </w:r>
     </w:p>
     <w:p>
       <w:pPr>
@@ -1626,21 +1398,8 @@
           <w:lang w:val="en-US"/>
         </w:rPr>
       </w:pPr>
-      <w:proofErr w:type="spellStart"/>
-      <w:r>
-        <w:t>Interesting</w:t>
-      </w:r>
-      <w:proofErr w:type="spellEnd"/>
-      <w:r>
-        <w:t xml:space="preserve"> </w:t>
-      </w:r>
-      <w:proofErr w:type="spellStart"/>
-      <w:r>
-        <w:t>aspects</w:t>
-      </w:r>
-      <w:proofErr w:type="spellEnd"/>
-      <w:r>
-        <w:t>:</w:t>
+      <w:r>
+        <w:t>Interesting aspects:</w:t>
       </w:r>
     </w:p>
     <w:p>
@@ -1656,29 +1415,8 @@
         </w:rPr>
       </w:pPr>
       <w:r>
-        <w:t xml:space="preserve">Routing: </w:t>
-      </w:r>
-      <w:proofErr w:type="spellStart"/>
-      <w:r>
-        <w:t>energy</w:t>
-      </w:r>
-      <w:proofErr w:type="spellEnd"/>
-      <w:r>
-        <w:t xml:space="preserve"> </w:t>
-      </w:r>
-      <w:proofErr w:type="spellStart"/>
-      <w:r>
-        <w:t>efficiency</w:t>
-      </w:r>
-      <w:proofErr w:type="spellEnd"/>
-      <w:r>
-        <w:t xml:space="preserve">, </w:t>
-      </w:r>
-      <w:proofErr w:type="spellStart"/>
-      <w:r>
-        <w:t>qos</w:t>
-      </w:r>
-      <w:proofErr w:type="spellEnd"/>
+        <w:t>Routing: energy efficiency, qos</w:t>
+      </w:r>
     </w:p>
     <w:p>
       <w:pPr>
@@ -1981,19 +1719,11 @@
           <w:lang w:val="en-US"/>
         </w:rPr>
       </w:pPr>
-      <w:proofErr w:type="gramStart"/>
-      <w:r>
-        <w:rPr>
-          <w:lang w:val="en-US"/>
-        </w:rPr>
-        <w:t>Also</w:t>
-      </w:r>
-      <w:proofErr w:type="gramEnd"/>
-      <w:r>
-        <w:rPr>
-          <w:lang w:val="en-US"/>
-        </w:rPr>
-        <w:t xml:space="preserve"> usable if some tasks are optional</w:t>
+      <w:r>
+        <w:rPr>
+          <w:lang w:val="en-US"/>
+        </w:rPr>
+        <w:t>Also usable if some tasks are optional</w:t>
       </w:r>
     </w:p>
     <w:p>
@@ -2066,19 +1796,11 @@
           <w:lang w:val="en-US"/>
         </w:rPr>
       </w:pPr>
-      <w:proofErr w:type="gramStart"/>
-      <w:r>
-        <w:rPr>
-          <w:lang w:val="en-US"/>
-        </w:rPr>
-        <w:t>Also</w:t>
-      </w:r>
-      <w:proofErr w:type="gramEnd"/>
-      <w:r>
-        <w:rPr>
-          <w:lang w:val="en-US"/>
-        </w:rPr>
-        <w:t xml:space="preserve"> initial assign/upgrade/downgrade</w:t>
+      <w:r>
+        <w:rPr>
+          <w:lang w:val="en-US"/>
+        </w:rPr>
+        <w:t>Also initial assign/upgrade/downgrade</w:t>
       </w:r>
     </w:p>
     <w:p>
@@ -2124,21 +1846,7 @@
         <w:rPr>
           <w:lang w:val="en-US"/>
         </w:rPr>
-        <w:t xml:space="preserve">A Review </w:t>
-      </w:r>
-      <w:proofErr w:type="gramStart"/>
-      <w:r>
-        <w:rPr>
-          <w:lang w:val="en-US"/>
-        </w:rPr>
-        <w:t>on</w:t>
-      </w:r>
-      <w:proofErr w:type="gramEnd"/>
-      <w:r>
-        <w:rPr>
-          <w:lang w:val="en-US"/>
-        </w:rPr>
-        <w:t xml:space="preserve"> energy management schemes in energy harvesting wireless sensor networks</w:t>
+        <w:t>A Review on energy management schemes in energy harvesting wireless sensor networks</w:t>
       </w:r>
     </w:p>
     <w:p>
@@ -2250,15 +1958,7 @@
         <w:t>Greed</w:t>
       </w:r>
       <w:r>
-        <w:t xml:space="preserve">y </w:t>
-      </w:r>
-      <w:proofErr w:type="spellStart"/>
-      <w:r>
-        <w:t>algorithm</w:t>
-      </w:r>
-      <w:proofErr w:type="spellEnd"/>
-      <w:r>
-        <w:t xml:space="preserve"> like 7</w:t>
+        <w:t>y algorithm like 7</w:t>
       </w:r>
     </w:p>
     <w:p>
@@ -2273,74 +1973,136 @@
           <w:lang w:val="en-US"/>
         </w:rPr>
       </w:pPr>
-      <w:proofErr w:type="spellStart"/>
-      <w:r>
-        <w:t>Recursive</w:t>
-      </w:r>
-      <w:proofErr w:type="spellEnd"/>
-      <w:r>
+      <w:r>
+        <w:t>Recursive search</w:t>
+      </w:r>
+    </w:p>
+    <w:p>
+      <w:pPr>
+        <w:pStyle w:val="Listenabsatz"/>
+        <w:numPr>
+          <w:ilvl w:val="0"/>
+          <w:numId w:val="22"/>
+        </w:numPr>
+        <w:jc w:val="both"/>
+        <w:rPr>
+          <w:lang w:val="en-US"/>
+        </w:rPr>
+      </w:pPr>
+      <w:r>
+        <w:rPr>
+          <w:lang w:val="en-US"/>
+        </w:rPr>
+        <w:t>Dynamic programming for optimal/</w:t>
+      </w:r>
+      <w:r>
+        <w:rPr>
+          <w:lang w:val="en-US"/>
+        </w:rPr>
+        <w:t>approximated solutions</w:t>
+      </w:r>
+    </w:p>
+    <w:p>
+      <w:pPr>
+        <w:pStyle w:val="Listenabsatz"/>
+        <w:numPr>
+          <w:ilvl w:val="0"/>
+          <w:numId w:val="22"/>
+        </w:numPr>
+        <w:jc w:val="both"/>
+        <w:rPr>
+          <w:lang w:val="en-US"/>
+        </w:rPr>
+      </w:pPr>
+      <w:r>
+        <w:rPr>
+          <w:lang w:val="en-US"/>
+        </w:rPr>
+        <w:t>Approximated with tolerance</w:t>
+      </w:r>
+    </w:p>
+    <w:p>
+      <w:pPr>
+        <w:jc w:val="both"/>
+        <w:rPr>
+          <w:lang w:val="en-US"/>
+        </w:rPr>
+      </w:pPr>
+    </w:p>
+    <w:p>
+      <w:pPr>
+        <w:pStyle w:val="Listenabsatz"/>
+        <w:numPr>
+          <w:ilvl w:val="0"/>
+          <w:numId w:val="5"/>
+        </w:numPr>
+        <w:jc w:val="both"/>
+        <w:rPr>
+          <w:lang w:val="en-US"/>
+        </w:rPr>
+      </w:pPr>
+      <w:r>
+        <w:rPr>
+          <w:lang w:val="en-US"/>
+        </w:rPr>
+        <w:t>Energy Management in</w:t>
+      </w:r>
+      <w:r>
+        <w:rPr>
+          <w:lang w:val="en-US"/>
+        </w:rPr>
         <w:t xml:space="preserve"> </w:t>
       </w:r>
-      <w:proofErr w:type="spellStart"/>
-      <w:r>
-        <w:t>search</w:t>
-      </w:r>
-      <w:proofErr w:type="spellEnd"/>
-    </w:p>
-    <w:p>
-      <w:pPr>
-        <w:pStyle w:val="Listenabsatz"/>
-        <w:numPr>
-          <w:ilvl w:val="0"/>
-          <w:numId w:val="22"/>
-        </w:numPr>
-        <w:jc w:val="both"/>
-        <w:rPr>
-          <w:lang w:val="en-US"/>
-        </w:rPr>
-      </w:pPr>
-      <w:r>
-        <w:rPr>
-          <w:lang w:val="en-US"/>
-        </w:rPr>
-        <w:t>Dynamic programming for optimal/</w:t>
-      </w:r>
-      <w:proofErr w:type="gramStart"/>
-      <w:r>
-        <w:rPr>
-          <w:lang w:val="en-US"/>
-        </w:rPr>
-        <w:t>approximated</w:t>
-      </w:r>
-      <w:proofErr w:type="gramEnd"/>
-      <w:r>
-        <w:rPr>
-          <w:lang w:val="en-US"/>
-        </w:rPr>
-        <w:t xml:space="preserve"> solutions</w:t>
-      </w:r>
-    </w:p>
-    <w:p>
-      <w:pPr>
-        <w:pStyle w:val="Listenabsatz"/>
-        <w:numPr>
-          <w:ilvl w:val="0"/>
-          <w:numId w:val="22"/>
-        </w:numPr>
-        <w:jc w:val="both"/>
-        <w:rPr>
-          <w:lang w:val="en-US"/>
-        </w:rPr>
-      </w:pPr>
-      <w:r>
-        <w:rPr>
-          <w:lang w:val="en-US"/>
-        </w:rPr>
-        <w:t>Approximated with tolerance</w:t>
-      </w:r>
-    </w:p>
-    <w:p>
-      <w:pPr>
+      <w:r>
+        <w:rPr>
+          <w:lang w:val="en-US"/>
+        </w:rPr>
+        <w:t>Wireless Sensor Networks</w:t>
+      </w:r>
+      <w:r>
+        <w:rPr>
+          <w:lang w:val="en-US"/>
+        </w:rPr>
+        <w:t xml:space="preserve"> </w:t>
+      </w:r>
+      <w:r>
+        <w:rPr>
+          <w:lang w:val="en-US"/>
+        </w:rPr>
+        <w:t>with Energy-Hungry Sensors</w:t>
+      </w:r>
+    </w:p>
+    <w:p>
+      <w:pPr>
+        <w:pStyle w:val="Listenabsatz"/>
+        <w:numPr>
+          <w:ilvl w:val="0"/>
+          <w:numId w:val="23"/>
+        </w:numPr>
+        <w:jc w:val="both"/>
+        <w:rPr>
+          <w:lang w:val="en-US"/>
+        </w:rPr>
+      </w:pPr>
+      <w:r>
+        <w:rPr>
+          <w:lang w:val="en-US"/>
+        </w:rPr>
+        <w:t>Interesting: harvesting aware adaptive sampling (LP)</w:t>
+      </w:r>
+    </w:p>
+    <w:p>
+      <w:pPr>
+        <w:pStyle w:val="Listenabsatz"/>
+        <w:jc w:val="both"/>
+        <w:rPr>
+          <w:lang w:val="en-US"/>
+        </w:rPr>
+      </w:pPr>
+    </w:p>
+    <w:p>
+      <w:pPr>
+        <w:pStyle w:val="Listenabsatz"/>
         <w:jc w:val="both"/>
         <w:rPr>
           <w:lang w:val="en-US"/>
@@ -2363,31 +2125,7 @@
         <w:rPr>
           <w:lang w:val="en-US"/>
         </w:rPr>
-        <w:t>Energy Management in</w:t>
-      </w:r>
-      <w:r>
-        <w:rPr>
-          <w:lang w:val="en-US"/>
-        </w:rPr>
-        <w:t xml:space="preserve"> </w:t>
-      </w:r>
-      <w:r>
-        <w:rPr>
-          <w:lang w:val="en-US"/>
-        </w:rPr>
-        <w:t>Wireless Sensor Networks</w:t>
-      </w:r>
-      <w:r>
-        <w:rPr>
-          <w:lang w:val="en-US"/>
-        </w:rPr>
-        <w:t xml:space="preserve"> </w:t>
-      </w:r>
-      <w:r>
-        <w:rPr>
-          <w:lang w:val="en-US"/>
-        </w:rPr>
-        <w:t>with Energy-Hungry Sensors</w:t>
+        <w:t>Efficient algorithms for maximum lifetime data gathering and aggregation in wireless sensor networks</w:t>
       </w:r>
     </w:p>
     <w:p>
@@ -2406,21 +2144,11 @@
         <w:rPr>
           <w:lang w:val="en-US"/>
         </w:rPr>
-        <w:t>Interesting: harvesting aware adaptive sampling (LP)</w:t>
-      </w:r>
-    </w:p>
-    <w:p>
-      <w:pPr>
-        <w:pStyle w:val="Listenabsatz"/>
-        <w:jc w:val="both"/>
-        <w:rPr>
-          <w:lang w:val="en-US"/>
-        </w:rPr>
-      </w:pPr>
-    </w:p>
-    <w:p>
-      <w:pPr>
-        <w:pStyle w:val="Listenabsatz"/>
+        <w:t>Just maximize lifetime</w:t>
+      </w:r>
+    </w:p>
+    <w:p>
+      <w:pPr>
         <w:jc w:val="both"/>
         <w:rPr>
           <w:lang w:val="en-US"/>
@@ -2443,7 +2171,22 @@
         <w:rPr>
           <w:lang w:val="en-US"/>
         </w:rPr>
-        <w:t>Efficient algorithms for maximum lifetime data gathering and aggregation in wireless sensor networks</w:t>
+        <w:t>Dynamic Sample Rate Adaptation for Long-TermIoT Sensing Applications</w:t>
+      </w:r>
+    </w:p>
+    <w:p>
+      <w:pPr>
+        <w:ind w:left="720"/>
+        <w:jc w:val="both"/>
+        <w:rPr>
+          <w:lang w:val="en-US"/>
+        </w:rPr>
+      </w:pPr>
+      <w:r>
+        <w:rPr>
+          <w:lang w:val="en-US"/>
+        </w:rPr>
+        <w:t>Maximize lifetime of a sensor w/o energy harvesting while maximizing sampling quality</w:t>
       </w:r>
     </w:p>
     <w:p>
@@ -2462,7 +2205,27 @@
         <w:rPr>
           <w:lang w:val="en-US"/>
         </w:rPr>
-        <w:t>Just maximize lifetime</w:t>
+        <w:lastRenderedPageBreak/>
+        <w:t>During constant phases -&gt; sample less to save energy</w:t>
+      </w:r>
+    </w:p>
+    <w:p>
+      <w:pPr>
+        <w:pStyle w:val="Listenabsatz"/>
+        <w:numPr>
+          <w:ilvl w:val="0"/>
+          <w:numId w:val="23"/>
+        </w:numPr>
+        <w:jc w:val="both"/>
+        <w:rPr>
+          <w:lang w:val="en-US"/>
+        </w:rPr>
+      </w:pPr>
+      <w:r>
+        <w:rPr>
+          <w:lang w:val="en-US"/>
+        </w:rPr>
+        <w:t>Use Bollinger bands or vertical distance based estimation to determine best sampling rate at a time (better)</w:t>
       </w:r>
     </w:p>
     <w:p>
@@ -2547,15 +2310,7 @@
         </w:rPr>
       </w:pPr>
       <w:r>
-        <w:t xml:space="preserve">Monte-Carlo </w:t>
-      </w:r>
-      <w:proofErr w:type="spellStart"/>
-      <w:r>
-        <w:t>Tree</w:t>
-      </w:r>
-      <w:proofErr w:type="spellEnd"/>
-      <w:r>
-        <w:t xml:space="preserve"> Search</w:t>
+        <w:t>Monte-Carlo Tree Search</w:t>
       </w:r>
     </w:p>
     <w:p>
@@ -2822,7 +2577,7 @@
         <w:rFonts w:hint="default"/>
       </w:rPr>
     </w:lvl>
-    <w:lvl w:ilvl="1" w:tplc="04070019" w:tentative="1">
+    <w:lvl w:ilvl="1" w:tplc="04070019">
       <w:start w:val="1"/>
       <w:numFmt w:val="lowerLetter"/>
       <w:lvlText w:val="%2."/>
@@ -2898,7 +2653,7 @@
   <w:abstractNum w:abstractNumId="1" w15:restartNumberingAfterBreak="0">
     <w:nsid w:val="019A1784"/>
     <w:multiLevelType w:val="hybridMultilevel"/>
-    <w:tmpl w:val="1E1EDA6E"/>
+    <w:tmpl w:val="7EAE38EA"/>
     <w:lvl w:ilvl="0" w:tplc="04070001">
       <w:start w:val="1"/>
       <w:numFmt w:val="bullet"/>

</xml_diff>